<commit_message>
add solution for topic 04
</commit_message>
<xml_diff>
--- a/TP-KB-252-Daria-Yehorova-lpr.docx
+++ b/TP-KB-252-Daria-Yehorova-lpr.docx
@@ -340,7 +340,6 @@
           <w:noProof/>
           <w:lang w:val="uk-UA"/>
         </w:rPr>
-        <w:lastRenderedPageBreak/>
         <w:drawing>
           <wp:inline distT="0" distB="0" distL="0" distR="0" wp14:anchorId="4240BB79" wp14:editId="4864E10E">
             <wp:extent cx="3970364" cy="1333616"/>
@@ -396,6 +395,7 @@
           <w:bCs/>
           <w:lang w:val="uk-UA"/>
         </w:rPr>
+        <w:lastRenderedPageBreak/>
         <w:t>Тестування функцій</w:t>
       </w:r>
     </w:p>
@@ -597,7 +597,6 @@
           <w:szCs w:val="28"/>
           <w:lang w:val="uk-UA"/>
         </w:rPr>
-        <w:lastRenderedPageBreak/>
         <w:drawing>
           <wp:inline distT="0" distB="0" distL="0" distR="0" wp14:anchorId="1D3C5274" wp14:editId="2E33E743">
             <wp:extent cx="4107536" cy="1859441"/>
@@ -740,7 +739,16 @@
           <w:szCs w:val="28"/>
           <w:lang w:val="uk-UA"/>
         </w:rPr>
-        <w:t xml:space="preserve"> можна вводити також числа з десятковою частиною (можна також і без нього). </w:t>
+        <w:t xml:space="preserve"> можна вводити також числа з десятковою </w:t>
+      </w:r>
+      <w:r>
+        <w:rPr>
+          <w:rFonts w:cs="Times New Roman"/>
+          <w:szCs w:val="28"/>
+          <w:lang w:val="uk-UA"/>
+        </w:rPr>
+        <w:lastRenderedPageBreak/>
+        <w:t xml:space="preserve">частиною (можна також і без нього). </w:t>
       </w:r>
       <w:proofErr w:type="spellStart"/>
       <w:r>
@@ -1099,7 +1107,6 @@
           <w:szCs w:val="28"/>
           <w:lang w:val="uk-UA"/>
         </w:rPr>
-        <w:lastRenderedPageBreak/>
         <w:drawing>
           <wp:inline distT="0" distB="0" distL="0" distR="0" wp14:anchorId="12A7A1FF" wp14:editId="43FE7E6A">
             <wp:extent cx="3917019" cy="1676545"/>
@@ -1250,6 +1257,7 @@
           <w:noProof/>
           <w:lang w:val="ru-RU"/>
         </w:rPr>
+        <w:lastRenderedPageBreak/>
         <w:drawing>
           <wp:inline distT="0" distB="0" distL="0" distR="0" wp14:anchorId="7705EBBE" wp14:editId="313DE317">
             <wp:extent cx="4919373" cy="2430780"/>
@@ -1418,238 +1426,238 @@
         <w:rPr>
           <w:lang w:val="uk-UA"/>
         </w:rPr>
+        <w:t xml:space="preserve">У першому завданні я створила функцію </w:t>
+      </w:r>
+      <w:r>
+        <w:rPr>
+          <w:lang w:val="uk-UA"/>
+        </w:rPr>
+        <w:t>«</w:t>
+      </w:r>
+      <w:r>
+        <w:t>solve</w:t>
+      </w:r>
+      <w:r>
+        <w:rPr>
+          <w:lang w:val="uk-UA"/>
+        </w:rPr>
+        <w:t>_</w:t>
+      </w:r>
+      <w:r>
+        <w:t>equation</w:t>
+      </w:r>
+      <w:r>
+        <w:rPr>
+          <w:lang w:val="uk-UA"/>
+        </w:rPr>
+        <w:t>»</w:t>
+      </w:r>
+      <w:r>
+        <w:rPr>
+          <w:lang w:val="uk-UA"/>
+        </w:rPr>
+        <w:t xml:space="preserve">, яка шукає корені квадратного рівняння. Для цього я використала свою функцію </w:t>
+      </w:r>
+      <w:r>
+        <w:rPr>
+          <w:lang w:val="uk-UA"/>
+        </w:rPr>
+        <w:t>«</w:t>
+      </w:r>
+      <w:proofErr w:type="spellStart"/>
+      <w:r>
+        <w:rPr>
+          <w:lang w:val="uk-UA"/>
+        </w:rPr>
+        <w:t>diskr</w:t>
+      </w:r>
+      <w:proofErr w:type="spellEnd"/>
+      <w:r>
+        <w:rPr>
+          <w:lang w:val="uk-UA"/>
+        </w:rPr>
+        <w:t>»</w:t>
+      </w:r>
+      <w:r>
+        <w:rPr>
+          <w:lang w:val="uk-UA"/>
+        </w:rPr>
+        <w:t xml:space="preserve"> з попередньої теми, що рахує дискримінант. За допомогою конструкції </w:t>
+      </w:r>
+      <w:r>
+        <w:rPr>
+          <w:lang w:val="uk-UA"/>
+        </w:rPr>
+        <w:t>«</w:t>
+      </w:r>
+      <w:r>
+        <w:t>if</w:t>
+      </w:r>
+      <w:r>
+        <w:rPr>
+          <w:lang w:val="uk-UA"/>
+        </w:rPr>
+        <w:t xml:space="preserve"> / </w:t>
+      </w:r>
+      <w:proofErr w:type="spellStart"/>
+      <w:r>
+        <w:t>elif</w:t>
+      </w:r>
+      <w:proofErr w:type="spellEnd"/>
+      <w:r>
+        <w:rPr>
+          <w:lang w:val="uk-UA"/>
+        </w:rPr>
+        <w:t xml:space="preserve"> / </w:t>
+      </w:r>
+      <w:r>
+        <w:t>else</w:t>
+      </w:r>
+      <w:r>
+        <w:rPr>
+          <w:lang w:val="uk-UA"/>
+        </w:rPr>
+        <w:t>»</w:t>
+      </w:r>
+      <w:r>
+        <w:rPr>
+          <w:lang w:val="uk-UA"/>
+        </w:rPr>
+        <w:t xml:space="preserve"> я додала перевірку: якщо a = 0, то рівняння не є квадратним, якщо D</w:t>
+      </w:r>
+      <w:r>
+        <w:rPr>
+          <w:lang w:val="uk-UA"/>
+        </w:rPr>
+        <w:t xml:space="preserve"> </w:t>
+      </w:r>
+      <w:r>
+        <w:rPr>
+          <w:lang w:val="uk-UA"/>
+        </w:rPr>
+        <w:t xml:space="preserve">&gt; </w:t>
+      </w:r>
+      <w:r>
+        <w:rPr>
+          <w:lang w:val="uk-UA"/>
+        </w:rPr>
+        <w:t xml:space="preserve">0 </w:t>
+      </w:r>
+      <w:r>
+        <w:rPr>
+          <w:lang w:val="uk-UA"/>
+        </w:rPr>
+        <w:t>-</w:t>
+      </w:r>
+      <w:r>
+        <w:rPr>
+          <w:lang w:val="uk-UA"/>
+        </w:rPr>
+        <w:t xml:space="preserve"> програма рахує два корені через </w:t>
+      </w:r>
+      <w:r>
+        <w:rPr>
+          <w:lang w:val="uk-UA"/>
+        </w:rPr>
+        <w:t>«</w:t>
+      </w:r>
+      <w:proofErr w:type="spellStart"/>
+      <w:r>
+        <w:rPr>
+          <w:lang w:val="uk-UA"/>
+        </w:rPr>
+        <w:t>math.sqrt</w:t>
+      </w:r>
+      <w:proofErr w:type="spellEnd"/>
+      <w:r>
+        <w:rPr>
+          <w:lang w:val="uk-UA"/>
+        </w:rPr>
+        <w:t>()</w:t>
+      </w:r>
+      <w:r>
+        <w:rPr>
+          <w:lang w:val="uk-UA"/>
+        </w:rPr>
+        <w:t>»</w:t>
+      </w:r>
+      <w:r>
+        <w:rPr>
+          <w:lang w:val="uk-UA"/>
+        </w:rPr>
+        <w:t>, якщо D = 0</w:t>
+      </w:r>
+      <w:r>
+        <w:rPr>
+          <w:lang w:val="uk-UA"/>
+        </w:rPr>
+        <w:t xml:space="preserve"> - </w:t>
+      </w:r>
+      <w:r>
+        <w:rPr>
+          <w:lang w:val="uk-UA"/>
+        </w:rPr>
+        <w:t xml:space="preserve">один, а якщо D &lt; 0 </w:t>
+      </w:r>
+      <w:r>
+        <w:rPr>
+          <w:lang w:val="uk-UA"/>
+        </w:rPr>
+        <w:t>-</w:t>
+      </w:r>
+      <w:r>
+        <w:rPr>
+          <w:lang w:val="uk-UA"/>
+        </w:rPr>
+        <w:t xml:space="preserve"> виводить, що коренів немає. Програма працює </w:t>
+      </w:r>
+      <w:proofErr w:type="spellStart"/>
+      <w:r>
+        <w:rPr>
+          <w:lang w:val="uk-UA"/>
+        </w:rPr>
+        <w:t>коректно</w:t>
+      </w:r>
+      <w:proofErr w:type="spellEnd"/>
+      <w:r>
+        <w:rPr>
+          <w:lang w:val="uk-UA"/>
+        </w:rPr>
+        <w:t xml:space="preserve"> та видає правильний результат.</w:t>
+      </w:r>
+    </w:p>
+    <w:p>
+      <w:pPr>
+        <w:spacing w:after="0"/>
+        <w:ind w:firstLine="709"/>
+        <w:contextualSpacing/>
+        <w:rPr>
+          <w:lang w:val="uk-UA"/>
+        </w:rPr>
+      </w:pPr>
+      <w:r>
+        <w:rPr>
+          <w:lang w:val="uk-UA"/>
+        </w:rPr>
+        <w:t>Текст програми:</w:t>
+      </w:r>
+    </w:p>
+    <w:p>
+      <w:pPr>
+        <w:spacing w:after="0"/>
+        <w:ind w:firstLine="709"/>
+        <w:contextualSpacing/>
+        <w:jc w:val="center"/>
+        <w:rPr>
+          <w:lang w:val="uk-UA"/>
+        </w:rPr>
+      </w:pPr>
+      <w:r>
+        <w:rPr>
+          <w:noProof/>
+          <w:lang w:val="uk-UA"/>
+        </w:rPr>
         <w:lastRenderedPageBreak/>
-        <w:t xml:space="preserve">У першому завданні я створила функцію </w:t>
-      </w:r>
-      <w:r>
-        <w:rPr>
-          <w:lang w:val="uk-UA"/>
-        </w:rPr>
-        <w:t>«</w:t>
-      </w:r>
-      <w:r>
-        <w:t>solve</w:t>
-      </w:r>
-      <w:r>
-        <w:rPr>
-          <w:lang w:val="uk-UA"/>
-        </w:rPr>
-        <w:t>_</w:t>
-      </w:r>
-      <w:r>
-        <w:t>equation</w:t>
-      </w:r>
-      <w:r>
-        <w:rPr>
-          <w:lang w:val="uk-UA"/>
-        </w:rPr>
-        <w:t>»</w:t>
-      </w:r>
-      <w:r>
-        <w:rPr>
-          <w:lang w:val="uk-UA"/>
-        </w:rPr>
-        <w:t xml:space="preserve">, яка шукає корені квадратного рівняння. Для цього я використала свою функцію </w:t>
-      </w:r>
-      <w:r>
-        <w:rPr>
-          <w:lang w:val="uk-UA"/>
-        </w:rPr>
-        <w:t>«</w:t>
-      </w:r>
-      <w:proofErr w:type="spellStart"/>
-      <w:r>
-        <w:rPr>
-          <w:lang w:val="uk-UA"/>
-        </w:rPr>
-        <w:t>diskr</w:t>
-      </w:r>
-      <w:proofErr w:type="spellEnd"/>
-      <w:r>
-        <w:rPr>
-          <w:lang w:val="uk-UA"/>
-        </w:rPr>
-        <w:t>»</w:t>
-      </w:r>
-      <w:r>
-        <w:rPr>
-          <w:lang w:val="uk-UA"/>
-        </w:rPr>
-        <w:t xml:space="preserve"> з попередньої теми, що рахує дискримінант. За допомогою конструкції </w:t>
-      </w:r>
-      <w:r>
-        <w:rPr>
-          <w:lang w:val="uk-UA"/>
-        </w:rPr>
-        <w:t>«</w:t>
-      </w:r>
-      <w:r>
-        <w:t>if</w:t>
-      </w:r>
-      <w:r>
-        <w:rPr>
-          <w:lang w:val="uk-UA"/>
-        </w:rPr>
-        <w:t xml:space="preserve"> / </w:t>
-      </w:r>
-      <w:proofErr w:type="spellStart"/>
-      <w:r>
-        <w:t>elif</w:t>
-      </w:r>
-      <w:proofErr w:type="spellEnd"/>
-      <w:r>
-        <w:rPr>
-          <w:lang w:val="uk-UA"/>
-        </w:rPr>
-        <w:t xml:space="preserve"> / </w:t>
-      </w:r>
-      <w:r>
-        <w:t>else</w:t>
-      </w:r>
-      <w:r>
-        <w:rPr>
-          <w:lang w:val="uk-UA"/>
-        </w:rPr>
-        <w:t>»</w:t>
-      </w:r>
-      <w:r>
-        <w:rPr>
-          <w:lang w:val="uk-UA"/>
-        </w:rPr>
-        <w:t xml:space="preserve"> я додала перевірку: якщо a = 0, то рівняння не є квадратним, якщо D</w:t>
-      </w:r>
-      <w:r>
-        <w:rPr>
-          <w:lang w:val="uk-UA"/>
-        </w:rPr>
-        <w:t xml:space="preserve"> </w:t>
-      </w:r>
-      <w:r>
-        <w:rPr>
-          <w:lang w:val="uk-UA"/>
-        </w:rPr>
-        <w:t xml:space="preserve">&gt; </w:t>
-      </w:r>
-      <w:r>
-        <w:rPr>
-          <w:lang w:val="uk-UA"/>
-        </w:rPr>
-        <w:t xml:space="preserve">0 </w:t>
-      </w:r>
-      <w:r>
-        <w:rPr>
-          <w:lang w:val="uk-UA"/>
-        </w:rPr>
-        <w:t>-</w:t>
-      </w:r>
-      <w:r>
-        <w:rPr>
-          <w:lang w:val="uk-UA"/>
-        </w:rPr>
-        <w:t xml:space="preserve"> програма рахує два корені через </w:t>
-      </w:r>
-      <w:r>
-        <w:rPr>
-          <w:lang w:val="uk-UA"/>
-        </w:rPr>
-        <w:t>«</w:t>
-      </w:r>
-      <w:proofErr w:type="spellStart"/>
-      <w:r>
-        <w:rPr>
-          <w:lang w:val="uk-UA"/>
-        </w:rPr>
-        <w:t>math.sqrt</w:t>
-      </w:r>
-      <w:proofErr w:type="spellEnd"/>
-      <w:r>
-        <w:rPr>
-          <w:lang w:val="uk-UA"/>
-        </w:rPr>
-        <w:t>()</w:t>
-      </w:r>
-      <w:r>
-        <w:rPr>
-          <w:lang w:val="uk-UA"/>
-        </w:rPr>
-        <w:t>»</w:t>
-      </w:r>
-      <w:r>
-        <w:rPr>
-          <w:lang w:val="uk-UA"/>
-        </w:rPr>
-        <w:t>, якщо D = 0</w:t>
-      </w:r>
-      <w:r>
-        <w:rPr>
-          <w:lang w:val="uk-UA"/>
-        </w:rPr>
-        <w:t xml:space="preserve"> - </w:t>
-      </w:r>
-      <w:r>
-        <w:rPr>
-          <w:lang w:val="uk-UA"/>
-        </w:rPr>
-        <w:t xml:space="preserve">один, а якщо D &lt; 0 </w:t>
-      </w:r>
-      <w:r>
-        <w:rPr>
-          <w:lang w:val="uk-UA"/>
-        </w:rPr>
-        <w:t>-</w:t>
-      </w:r>
-      <w:r>
-        <w:rPr>
-          <w:lang w:val="uk-UA"/>
-        </w:rPr>
-        <w:t xml:space="preserve"> виводить, що коренів немає. Програма працює </w:t>
-      </w:r>
-      <w:proofErr w:type="spellStart"/>
-      <w:r>
-        <w:rPr>
-          <w:lang w:val="uk-UA"/>
-        </w:rPr>
-        <w:t>коректно</w:t>
-      </w:r>
-      <w:proofErr w:type="spellEnd"/>
-      <w:r>
-        <w:rPr>
-          <w:lang w:val="uk-UA"/>
-        </w:rPr>
-        <w:t xml:space="preserve"> та видає правильний результат.</w:t>
-      </w:r>
-    </w:p>
-    <w:p>
-      <w:pPr>
-        <w:spacing w:after="0"/>
-        <w:ind w:firstLine="709"/>
-        <w:contextualSpacing/>
-        <w:rPr>
-          <w:lang w:val="uk-UA"/>
-        </w:rPr>
-      </w:pPr>
-      <w:r>
-        <w:rPr>
-          <w:lang w:val="uk-UA"/>
-        </w:rPr>
-        <w:t>Текст програми:</w:t>
-      </w:r>
-    </w:p>
-    <w:p>
-      <w:pPr>
-        <w:spacing w:after="0"/>
-        <w:ind w:firstLine="709"/>
-        <w:contextualSpacing/>
-        <w:jc w:val="center"/>
-        <w:rPr>
-          <w:lang w:val="uk-UA"/>
-        </w:rPr>
-      </w:pPr>
-      <w:r>
-        <w:rPr>
-          <w:noProof/>
-          <w:lang w:val="uk-UA"/>
-        </w:rPr>
         <w:drawing>
           <wp:inline distT="0" distB="0" distL="0" distR="0" wp14:anchorId="003A581A" wp14:editId="0FCE4314">
             <wp:extent cx="4046220" cy="3748600"/>
@@ -1752,7 +1760,6 @@
         <w:rPr>
           <w:lang w:val="uk-UA"/>
         </w:rPr>
-        <w:lastRenderedPageBreak/>
         <w:t xml:space="preserve">Результат: </w:t>
       </w:r>
     </w:p>
@@ -1923,6 +1930,7 @@
           <w:rFonts w:cs="Times New Roman"/>
           <w:lang w:val="uk-UA"/>
         </w:rPr>
+        <w:lastRenderedPageBreak/>
         <w:t xml:space="preserve">У другому завданні я написала програму-калькулятор із використанням конструкції </w:t>
       </w:r>
       <w:r>
@@ -2005,7 +2013,6 @@
           <w:noProof/>
           <w:lang w:val="uk-UA"/>
         </w:rPr>
-        <w:lastRenderedPageBreak/>
         <w:drawing>
           <wp:inline distT="0" distB="0" distL="0" distR="0" wp14:anchorId="39AF7404" wp14:editId="422DC52E">
             <wp:extent cx="3398520" cy="4352063"/>
@@ -2167,6 +2174,7 @@
         <w:rPr>
           <w:lang w:val="ru-RU"/>
         </w:rPr>
+        <w:lastRenderedPageBreak/>
         <w:t xml:space="preserve">Я повинна </w:t>
       </w:r>
       <w:r>
@@ -2204,14 +2212,7 @@
         <w:rPr>
           <w:lang w:val="uk-UA"/>
         </w:rPr>
-        <w:t xml:space="preserve">Як і в попередньому завданні, кожну операцію я реалізувала в окремій функції. Програма отримує від користувача числа та оператор, порівнює </w:t>
-      </w:r>
-      <w:r>
-        <w:rPr>
-          <w:lang w:val="uk-UA"/>
-        </w:rPr>
-        <w:lastRenderedPageBreak/>
-        <w:t xml:space="preserve">введений знак у блоці </w:t>
+        <w:t xml:space="preserve">Як і в попередньому завданні, кожну операцію я реалізувала в окремій функції. Програма отримує від користувача числа та оператор, порівнює введений знак у блоці </w:t>
       </w:r>
       <w:proofErr w:type="spellStart"/>
       <w:r>
@@ -2327,6 +2328,7 @@
           <w:noProof/>
           <w:lang w:val="uk-UA"/>
         </w:rPr>
+        <w:lastRenderedPageBreak/>
         <w:drawing>
           <wp:inline distT="0" distB="0" distL="0" distR="0" wp14:anchorId="55916886" wp14:editId="4663D337">
             <wp:extent cx="4206605" cy="1539373"/>
@@ -2388,7 +2390,6 @@
         <w:rPr>
           <w:lang w:val="uk-UA"/>
         </w:rPr>
-        <w:lastRenderedPageBreak/>
         <w:t xml:space="preserve">Посилання на </w:t>
       </w:r>
       <w:proofErr w:type="spellStart"/>
@@ -2589,19 +2590,7 @@
         <w:rPr>
           <w:lang w:val="uk-UA"/>
         </w:rPr>
-        <w:t>Під час виконання практичного завдання до Теми №</w:t>
-      </w:r>
-      <w:r>
-        <w:rPr>
-          <w:lang w:val="uk-UA"/>
-        </w:rPr>
-        <w:t>3</w:t>
-      </w:r>
-      <w:r>
-        <w:rPr>
-          <w:lang w:val="uk-UA"/>
-        </w:rPr>
-        <w:t xml:space="preserve"> було надано варіанти рішення до наступних задач:</w:t>
+        <w:t>Під час виконання практичного завдання до Теми №3 було надано варіанти рішення до наступних задач:</w:t>
       </w:r>
     </w:p>
     <w:p>
@@ -2668,6 +2657,7 @@
         <w:rPr>
           <w:lang w:val="uk-UA"/>
         </w:rPr>
+        <w:lastRenderedPageBreak/>
         <w:t xml:space="preserve">У першому завданні я доопрацювала програму-калькулятор з попередньої теми, додавши нескінченний цикл </w:t>
       </w:r>
       <w:r>
@@ -2740,14 +2730,7 @@
         <w:rPr>
           <w:lang w:val="uk-UA"/>
         </w:rPr>
-        <w:t xml:space="preserve">, цикл </w:t>
-      </w:r>
-      <w:r>
-        <w:rPr>
-          <w:lang w:val="uk-UA"/>
-        </w:rPr>
-        <w:lastRenderedPageBreak/>
-        <w:t xml:space="preserve">переривається за допомогою оператора </w:t>
+        <w:t xml:space="preserve">, цикл переривається за допомогою оператора </w:t>
       </w:r>
       <w:r>
         <w:rPr>
@@ -2799,6 +2782,7 @@
       </w:pPr>
       <w:r>
         <w:rPr>
+          <w:noProof/>
           <w:lang w:val="uk-UA"/>
         </w:rPr>
         <w:drawing>
@@ -2862,6 +2846,9 @@
         <w:jc w:val="center"/>
       </w:pPr>
       <w:r>
+        <w:rPr>
+          <w:noProof/>
+        </w:rPr>
         <w:lastRenderedPageBreak/>
         <w:drawing>
           <wp:inline distT="0" distB="0" distL="0" distR="0" wp14:anchorId="1814D360" wp14:editId="13C7C633">
@@ -3239,6 +3226,7 @@
       </w:pPr>
       <w:r>
         <w:rPr>
+          <w:noProof/>
           <w:lang w:val="uk-UA"/>
         </w:rPr>
         <w:lastRenderedPageBreak/>
@@ -3307,6 +3295,7 @@
       </w:pPr>
       <w:r>
         <w:rPr>
+          <w:noProof/>
           <w:lang w:val="uk-UA"/>
         </w:rPr>
         <w:drawing>
@@ -3399,8 +3388,161 @@
         <w:rPr>
           <w:lang w:val="uk-UA"/>
         </w:rPr>
+        <w:t xml:space="preserve">У третьому завданні я створила програму для тестування методів роботи зі словниками. Я вивела ключі через </w:t>
+      </w:r>
+      <w:r>
+        <w:rPr>
+          <w:lang w:val="uk-UA"/>
+        </w:rPr>
+        <w:t>«</w:t>
+      </w:r>
+      <w:r>
+        <w:t>keys</w:t>
+      </w:r>
+      <w:r>
+        <w:rPr>
+          <w:lang w:val="ru-RU"/>
+        </w:rPr>
+        <w:t>(</w:t>
+      </w:r>
+      <w:r>
+        <w:rPr>
+          <w:lang w:val="uk-UA"/>
+        </w:rPr>
+        <w:t>)</w:t>
+      </w:r>
+      <w:r>
+        <w:rPr>
+          <w:lang w:val="uk-UA"/>
+        </w:rPr>
+        <w:t>»</w:t>
+      </w:r>
+      <w:r>
+        <w:rPr>
+          <w:lang w:val="uk-UA"/>
+        </w:rPr>
+        <w:t xml:space="preserve">, значення через </w:t>
+      </w:r>
+      <w:r>
+        <w:rPr>
+          <w:lang w:val="uk-UA"/>
+        </w:rPr>
+        <w:t>«</w:t>
+      </w:r>
+      <w:r>
+        <w:t>values</w:t>
+      </w:r>
+      <w:r>
+        <w:rPr>
+          <w:lang w:val="uk-UA"/>
+        </w:rPr>
+        <w:t>()</w:t>
+      </w:r>
+      <w:r>
+        <w:rPr>
+          <w:lang w:val="uk-UA"/>
+        </w:rPr>
+        <w:t>»</w:t>
+      </w:r>
+      <w:r>
+        <w:rPr>
+          <w:lang w:val="uk-UA"/>
+        </w:rPr>
+        <w:t xml:space="preserve"> та всі пари через </w:t>
+      </w:r>
+      <w:r>
+        <w:rPr>
+          <w:lang w:val="uk-UA"/>
+        </w:rPr>
+        <w:t>«</w:t>
+      </w:r>
+      <w:r>
+        <w:t>items</w:t>
+      </w:r>
+      <w:r>
+        <w:rPr>
+          <w:lang w:val="ru-RU"/>
+        </w:rPr>
+        <w:t>(</w:t>
+      </w:r>
+      <w:r>
+        <w:rPr>
+          <w:lang w:val="uk-UA"/>
+        </w:rPr>
+        <w:t>)</w:t>
+      </w:r>
+      <w:r>
+        <w:rPr>
+          <w:lang w:val="uk-UA"/>
+        </w:rPr>
+        <w:t>»</w:t>
+      </w:r>
+      <w:r>
+        <w:rPr>
+          <w:lang w:val="uk-UA"/>
+        </w:rPr>
+        <w:t xml:space="preserve">. Далі за допомогою </w:t>
+      </w:r>
+      <w:r>
+        <w:rPr>
+          <w:lang w:val="uk-UA"/>
+        </w:rPr>
+        <w:t>«</w:t>
+      </w:r>
+      <w:r>
+        <w:t>update</w:t>
+      </w:r>
+      <w:r>
+        <w:rPr>
+          <w:lang w:val="ru-RU"/>
+        </w:rPr>
+        <w:t>(</w:t>
+      </w:r>
+      <w:r>
+        <w:rPr>
+          <w:lang w:val="uk-UA"/>
+        </w:rPr>
+        <w:t>)</w:t>
+      </w:r>
+      <w:r>
+        <w:rPr>
+          <w:lang w:val="uk-UA"/>
+        </w:rPr>
+        <w:t>»</w:t>
+      </w:r>
+      <w:r>
+        <w:rPr>
+          <w:lang w:val="uk-UA"/>
+        </w:rPr>
+        <w:t xml:space="preserve"> оновила вік та додала нове поле </w:t>
+      </w:r>
+      <w:r>
+        <w:rPr>
+          <w:lang w:val="uk-UA"/>
+        </w:rPr>
+        <w:t>«</w:t>
+      </w:r>
+      <w:r>
+        <w:t>city</w:t>
+      </w:r>
+      <w:r>
+        <w:rPr>
+          <w:lang w:val="uk-UA"/>
+        </w:rPr>
+        <w:t>»</w:t>
+      </w:r>
+      <w:r>
+        <w:rPr>
+          <w:lang w:val="uk-UA"/>
+        </w:rPr>
+        <w:t xml:space="preserve">, після </w:t>
+      </w:r>
+      <w:r>
+        <w:rPr>
+          <w:lang w:val="uk-UA"/>
+        </w:rPr>
         <w:lastRenderedPageBreak/>
-        <w:t xml:space="preserve">У третьому завданні я створила програму для тестування методів роботи зі словниками. Я вивела ключі через </w:t>
+        <w:t xml:space="preserve">чого видалила його за допомогою оператора </w:t>
       </w:r>
       <w:r>
         <w:rPr>
@@ -3409,19 +3551,7 @@
         <w:t>«</w:t>
       </w:r>
       <w:r>
-        <w:t>keys</w:t>
-      </w:r>
-      <w:r>
-        <w:rPr>
-          <w:lang w:val="ru-RU"/>
-        </w:rPr>
-        <w:t>(</w:t>
-      </w:r>
-      <w:r>
-        <w:rPr>
-          <w:lang w:val="uk-UA"/>
-        </w:rPr>
-        <w:t>)</w:t>
+        <w:t>del</w:t>
       </w:r>
       <w:r>
         <w:rPr>
@@ -3433,7 +3563,7 @@
         <w:rPr>
           <w:lang w:val="uk-UA"/>
         </w:rPr>
-        <w:t xml:space="preserve">, значення через </w:t>
+        <w:t xml:space="preserve">. Наприкінці я повністю очистила словник методом </w:t>
       </w:r>
       <w:r>
         <w:rPr>
@@ -3442,13 +3572,7 @@
         <w:t>«</w:t>
       </w:r>
       <w:r>
-        <w:t>values</w:t>
-      </w:r>
-      <w:r>
-        <w:rPr>
-          <w:lang w:val="uk-UA"/>
-        </w:rPr>
-        <w:t>()</w:t>
+        <w:t>clear()</w:t>
       </w:r>
       <w:r>
         <w:rPr>
@@ -3457,135 +3581,6 @@
         <w:t>»</w:t>
       </w:r>
       <w:r>
-        <w:rPr>
-          <w:lang w:val="uk-UA"/>
-        </w:rPr>
-        <w:t xml:space="preserve"> та всі пари через </w:t>
-      </w:r>
-      <w:r>
-        <w:rPr>
-          <w:lang w:val="uk-UA"/>
-        </w:rPr>
-        <w:t>«</w:t>
-      </w:r>
-      <w:r>
-        <w:t>items</w:t>
-      </w:r>
-      <w:r>
-        <w:rPr>
-          <w:lang w:val="ru-RU"/>
-        </w:rPr>
-        <w:t>(</w:t>
-      </w:r>
-      <w:r>
-        <w:rPr>
-          <w:lang w:val="uk-UA"/>
-        </w:rPr>
-        <w:t>)</w:t>
-      </w:r>
-      <w:r>
-        <w:rPr>
-          <w:lang w:val="uk-UA"/>
-        </w:rPr>
-        <w:t>»</w:t>
-      </w:r>
-      <w:r>
-        <w:rPr>
-          <w:lang w:val="uk-UA"/>
-        </w:rPr>
-        <w:t xml:space="preserve">. Далі за допомогою </w:t>
-      </w:r>
-      <w:r>
-        <w:rPr>
-          <w:lang w:val="uk-UA"/>
-        </w:rPr>
-        <w:t>«</w:t>
-      </w:r>
-      <w:r>
-        <w:t>update</w:t>
-      </w:r>
-      <w:r>
-        <w:rPr>
-          <w:lang w:val="ru-RU"/>
-        </w:rPr>
-        <w:t>(</w:t>
-      </w:r>
-      <w:r>
-        <w:rPr>
-          <w:lang w:val="uk-UA"/>
-        </w:rPr>
-        <w:t>)</w:t>
-      </w:r>
-      <w:r>
-        <w:rPr>
-          <w:lang w:val="uk-UA"/>
-        </w:rPr>
-        <w:t>»</w:t>
-      </w:r>
-      <w:r>
-        <w:rPr>
-          <w:lang w:val="uk-UA"/>
-        </w:rPr>
-        <w:t xml:space="preserve"> оновила вік та додала нове поле </w:t>
-      </w:r>
-      <w:r>
-        <w:rPr>
-          <w:lang w:val="uk-UA"/>
-        </w:rPr>
-        <w:t>«</w:t>
-      </w:r>
-      <w:r>
-        <w:t>city</w:t>
-      </w:r>
-      <w:r>
-        <w:rPr>
-          <w:lang w:val="uk-UA"/>
-        </w:rPr>
-        <w:t>»</w:t>
-      </w:r>
-      <w:r>
-        <w:rPr>
-          <w:lang w:val="uk-UA"/>
-        </w:rPr>
-        <w:t xml:space="preserve">, після чого видалила його за допомогою оператора </w:t>
-      </w:r>
-      <w:r>
-        <w:rPr>
-          <w:lang w:val="uk-UA"/>
-        </w:rPr>
-        <w:t>«</w:t>
-      </w:r>
-      <w:r>
-        <w:t>del</w:t>
-      </w:r>
-      <w:r>
-        <w:rPr>
-          <w:lang w:val="uk-UA"/>
-        </w:rPr>
-        <w:t>»</w:t>
-      </w:r>
-      <w:r>
-        <w:rPr>
-          <w:lang w:val="uk-UA"/>
-        </w:rPr>
-        <w:t xml:space="preserve">. Наприкінці я повністю очистила словник методом </w:t>
-      </w:r>
-      <w:r>
-        <w:rPr>
-          <w:lang w:val="uk-UA"/>
-        </w:rPr>
-        <w:t>«</w:t>
-      </w:r>
-      <w:r>
-        <w:t>clear()</w:t>
-      </w:r>
-      <w:r>
-        <w:rPr>
-          <w:lang w:val="uk-UA"/>
-        </w:rPr>
-        <w:t>»</w:t>
-      </w:r>
-      <w:r>
         <w:t>.</w:t>
       </w:r>
     </w:p>
@@ -3617,6 +3612,7 @@
       </w:pPr>
       <w:r>
         <w:rPr>
+          <w:noProof/>
           <w:lang w:val="uk-UA"/>
         </w:rPr>
         <w:drawing>
@@ -3684,6 +3680,7 @@
       </w:pPr>
       <w:r>
         <w:rPr>
+          <w:noProof/>
           <w:lang w:val="uk-UA"/>
         </w:rPr>
         <w:drawing>
@@ -3741,100 +3738,106 @@
           <w:bCs/>
           <w:lang w:val="uk-UA"/>
         </w:rPr>
+        <w:t>Пошук позиції для вставки у відсортований список</w:t>
+      </w:r>
+    </w:p>
+    <w:p>
+      <w:pPr>
+        <w:spacing w:after="0"/>
+        <w:ind w:firstLine="709"/>
+        <w:contextualSpacing/>
+        <w:rPr>
+          <w:lang w:val="uk-UA"/>
+        </w:rPr>
+      </w:pPr>
+      <w:r>
+        <w:rPr>
+          <w:lang w:val="uk-UA"/>
+        </w:rPr>
+        <w:t>Маючи відсортований список, написати функцію пошуку позиції для вставки нового елементу в список.</w:t>
+      </w:r>
+    </w:p>
+    <w:p>
+      <w:pPr>
+        <w:spacing w:after="0"/>
+        <w:ind w:firstLine="709"/>
+        <w:contextualSpacing/>
+        <w:rPr>
+          <w:lang w:val="uk-UA"/>
+        </w:rPr>
+      </w:pPr>
+      <w:r>
+        <w:rPr>
+          <w:lang w:val="uk-UA"/>
+        </w:rPr>
+        <w:t xml:space="preserve">У четвертому завданні я створила функцію </w:t>
+      </w:r>
+      <w:r>
+        <w:rPr>
+          <w:lang w:val="uk-UA"/>
+        </w:rPr>
+        <w:t>«</w:t>
+      </w:r>
+      <w:r>
+        <w:t>find</w:t>
+      </w:r>
+      <w:r>
+        <w:rPr>
+          <w:lang w:val="ru-RU"/>
+        </w:rPr>
+        <w:t>_</w:t>
+      </w:r>
+      <w:r>
+        <w:t>insert</w:t>
+      </w:r>
+      <w:r>
+        <w:rPr>
+          <w:lang w:val="ru-RU"/>
+        </w:rPr>
+        <w:t>_</w:t>
+      </w:r>
+      <w:r>
+        <w:t>position</w:t>
+      </w:r>
+      <w:r>
+        <w:rPr>
+          <w:lang w:val="uk-UA"/>
+        </w:rPr>
+        <w:t>»</w:t>
+      </w:r>
+      <w:r>
+        <w:rPr>
+          <w:lang w:val="uk-UA"/>
+        </w:rPr>
+        <w:t xml:space="preserve">, яка шукає індекс для вставки нового числа у відсортований список, зберігаючи його порядок. За допомогою циклу </w:t>
+      </w:r>
+      <w:r>
+        <w:rPr>
+          <w:lang w:val="uk-UA"/>
+        </w:rPr>
+        <w:t>«</w:t>
+      </w:r>
+      <w:r>
+        <w:t>for</w:t>
+      </w:r>
+      <w:r>
+        <w:rPr>
+          <w:lang w:val="uk-UA"/>
+        </w:rPr>
+        <w:t>»</w:t>
+      </w:r>
+      <w:r>
+        <w:rPr>
+          <w:lang w:val="uk-UA"/>
+        </w:rPr>
+        <w:t xml:space="preserve"> програма порівнює новий елемент із кожним значенням у </w:t>
+      </w:r>
+      <w:r>
+        <w:rPr>
+          <w:lang w:val="uk-UA"/>
+        </w:rPr>
         <w:lastRenderedPageBreak/>
-        <w:t>Пошук позиції для вставки у відсортований список</w:t>
-      </w:r>
-    </w:p>
-    <w:p>
-      <w:pPr>
-        <w:spacing w:after="0"/>
-        <w:ind w:firstLine="709"/>
-        <w:contextualSpacing/>
-        <w:rPr>
-          <w:lang w:val="uk-UA"/>
-        </w:rPr>
-      </w:pPr>
-      <w:r>
-        <w:rPr>
-          <w:lang w:val="uk-UA"/>
-        </w:rPr>
-        <w:t>Маючи відсортований список, написати функцію пошуку позиції для вставки нового елементу в список.</w:t>
-      </w:r>
-    </w:p>
-    <w:p>
-      <w:pPr>
-        <w:spacing w:after="0"/>
-        <w:ind w:firstLine="709"/>
-        <w:contextualSpacing/>
-        <w:rPr>
-          <w:lang w:val="uk-UA"/>
-        </w:rPr>
-      </w:pPr>
-      <w:r>
-        <w:rPr>
-          <w:lang w:val="uk-UA"/>
-        </w:rPr>
-        <w:t xml:space="preserve">У четвертому завданні я створила функцію </w:t>
-      </w:r>
-      <w:r>
-        <w:rPr>
-          <w:lang w:val="uk-UA"/>
-        </w:rPr>
-        <w:t>«</w:t>
-      </w:r>
-      <w:r>
-        <w:t>find</w:t>
-      </w:r>
-      <w:r>
-        <w:rPr>
-          <w:lang w:val="ru-RU"/>
-        </w:rPr>
-        <w:t>_</w:t>
-      </w:r>
-      <w:r>
-        <w:t>insert</w:t>
-      </w:r>
-      <w:r>
-        <w:rPr>
-          <w:lang w:val="ru-RU"/>
-        </w:rPr>
-        <w:t>_</w:t>
-      </w:r>
-      <w:r>
-        <w:t>position</w:t>
-      </w:r>
-      <w:r>
-        <w:rPr>
-          <w:lang w:val="uk-UA"/>
-        </w:rPr>
-        <w:t>»</w:t>
-      </w:r>
-      <w:r>
-        <w:rPr>
-          <w:lang w:val="uk-UA"/>
-        </w:rPr>
-        <w:t xml:space="preserve">, яка шукає індекс для вставки нового числа у відсортований список, зберігаючи його порядок. За допомогою циклу </w:t>
-      </w:r>
-      <w:r>
-        <w:rPr>
-          <w:lang w:val="uk-UA"/>
-        </w:rPr>
-        <w:t>«</w:t>
-      </w:r>
-      <w:r>
-        <w:t>for</w:t>
-      </w:r>
-      <w:r>
-        <w:rPr>
-          <w:lang w:val="uk-UA"/>
-        </w:rPr>
-        <w:t>»</w:t>
-      </w:r>
-      <w:r>
-        <w:rPr>
-          <w:lang w:val="uk-UA"/>
-        </w:rPr>
-        <w:t xml:space="preserve"> програма порівнює новий елемент із кожним значенням у списку й повертає індекс першого більшого елемента, а якщо таких немає</w:t>
+        <w:t>списку й повертає індекс першого більшого елемента, а якщо таких немає</w:t>
       </w:r>
       <w:r>
         <w:rPr>
@@ -3877,12 +3880,13 @@
       </w:pPr>
       <w:r>
         <w:rPr>
+          <w:noProof/>
           <w:lang w:val="uk-UA"/>
         </w:rPr>
         <w:drawing>
-          <wp:inline distT="0" distB="0" distL="0" distR="0" wp14:anchorId="32F32AF2" wp14:editId="35C34DB2">
-            <wp:extent cx="5128704" cy="3048264"/>
-            <wp:effectExtent l="0" t="0" r="0" b="0"/>
+          <wp:inline distT="0" distB="0" distL="0" distR="0" wp14:anchorId="32F32AF2" wp14:editId="3B4C3533">
+            <wp:extent cx="4511040" cy="2681153"/>
+            <wp:effectExtent l="0" t="0" r="3810" b="5080"/>
             <wp:docPr id="22" name="Рисунок 22"/>
             <wp:cNvGraphicFramePr>
               <a:graphicFrameLocks xmlns:a="http://schemas.openxmlformats.org/drawingml/2006/main" noChangeAspect="1"/>
@@ -3903,7 +3907,7 @@
                   <pic:spPr>
                     <a:xfrm>
                       <a:off x="0" y="0"/>
-                      <a:ext cx="5128704" cy="3048264"/>
+                      <a:ext cx="4519581" cy="2686229"/>
                     </a:xfrm>
                     <a:prstGeom prst="rect">
                       <a:avLst/>
@@ -3944,12 +3948,13 @@
       </w:pPr>
       <w:r>
         <w:rPr>
+          <w:noProof/>
           <w:lang w:val="uk-UA"/>
         </w:rPr>
         <w:drawing>
-          <wp:inline distT="0" distB="0" distL="0" distR="0" wp14:anchorId="0955445C" wp14:editId="272C401C">
-            <wp:extent cx="4145639" cy="1310754"/>
-            <wp:effectExtent l="0" t="0" r="7620" b="3810"/>
+          <wp:inline distT="0" distB="0" distL="0" distR="0" wp14:anchorId="0955445C" wp14:editId="326BAAF5">
+            <wp:extent cx="3779520" cy="1194996"/>
+            <wp:effectExtent l="0" t="0" r="0" b="5715"/>
             <wp:docPr id="23" name="Рисунок 23"/>
             <wp:cNvGraphicFramePr>
               <a:graphicFrameLocks xmlns:a="http://schemas.openxmlformats.org/drawingml/2006/main" noChangeAspect="1"/>
@@ -3970,7 +3975,7 @@
                   <pic:spPr>
                     <a:xfrm>
                       <a:off x="0" y="0"/>
-                      <a:ext cx="4145639" cy="1310754"/>
+                      <a:ext cx="3790554" cy="1198485"/>
                     </a:xfrm>
                     <a:prstGeom prst="rect">
                       <a:avLst/>
@@ -3988,31 +3993,14 @@
         <w:spacing w:after="0"/>
         <w:ind w:firstLine="0"/>
         <w:contextualSpacing/>
-        <w:jc w:val="center"/>
-      </w:pPr>
-    </w:p>
-    <w:p>
-      <w:pPr>
-        <w:spacing w:after="0"/>
-        <w:ind w:firstLine="0"/>
-        <w:contextualSpacing/>
-        <w:jc w:val="center"/>
-      </w:pPr>
-    </w:p>
-    <w:p>
-      <w:pPr>
-        <w:spacing w:after="0"/>
-        <w:ind w:firstLine="0"/>
-        <w:contextualSpacing/>
-        <w:rPr>
-          <w:lang w:val="ru-RU"/>
-        </w:rPr>
-      </w:pPr>
-      <w:r>
-        <w:rPr>
-          <w:lang w:val="uk-UA"/>
-        </w:rPr>
-        <w:lastRenderedPageBreak/>
+        <w:rPr>
+          <w:lang w:val="ru-RU"/>
+        </w:rPr>
+      </w:pPr>
+      <w:r>
+        <w:rPr>
+          <w:lang w:val="uk-UA"/>
+        </w:rPr>
         <w:t xml:space="preserve">Посилання на </w:t>
       </w:r>
       <w:proofErr w:type="spellStart"/>
@@ -4097,11 +4085,12 @@
       </w:pPr>
       <w:r>
         <w:rPr>
+          <w:noProof/>
           <w:lang w:val="ru-RU"/>
         </w:rPr>
         <w:drawing>
-          <wp:inline distT="0" distB="0" distL="0" distR="0" wp14:anchorId="04E2DE7E" wp14:editId="15CF7B64">
-            <wp:extent cx="5943600" cy="3395345"/>
+          <wp:inline distT="0" distB="0" distL="0" distR="0" wp14:anchorId="04E2DE7E" wp14:editId="132C7468">
+            <wp:extent cx="4748653" cy="2712720"/>
             <wp:effectExtent l="0" t="0" r="0" b="0"/>
             <wp:docPr id="25" name="Рисунок 25"/>
             <wp:cNvGraphicFramePr>
@@ -4123,7 +4112,7 @@
                   <pic:spPr>
                     <a:xfrm>
                       <a:off x="0" y="0"/>
-                      <a:ext cx="5943600" cy="3395345"/>
+                      <a:ext cx="4819517" cy="2753202"/>
                     </a:xfrm>
                     <a:prstGeom prst="rect">
                       <a:avLst/>
@@ -4139,6 +4128,1006 @@
     <w:p>
       <w:pPr>
         <w:spacing w:after="0"/>
+        <w:ind w:firstLine="709"/>
+        <w:contextualSpacing/>
+        <w:jc w:val="right"/>
+        <w:rPr>
+          <w:b/>
+          <w:bCs/>
+        </w:rPr>
+      </w:pPr>
+      <w:r>
+        <w:rPr>
+          <w:b/>
+          <w:bCs/>
+          <w:lang w:val="uk-UA"/>
+        </w:rPr>
+        <w:lastRenderedPageBreak/>
+        <w:t>Звіт до Теми №</w:t>
+      </w:r>
+      <w:r>
+        <w:rPr>
+          <w:b/>
+          <w:bCs/>
+        </w:rPr>
+        <w:t>4</w:t>
+      </w:r>
+    </w:p>
+    <w:p>
+      <w:pPr>
+        <w:spacing w:after="0"/>
+        <w:ind w:firstLine="709"/>
+        <w:contextualSpacing/>
+        <w:jc w:val="right"/>
+        <w:rPr>
+          <w:b/>
+          <w:bCs/>
+          <w:lang w:val="uk-UA"/>
+        </w:rPr>
+      </w:pPr>
+      <w:r>
+        <w:rPr>
+          <w:b/>
+          <w:bCs/>
+          <w:lang w:val="uk-UA"/>
+        </w:rPr>
+        <w:t>Функції та змінні</w:t>
+      </w:r>
+    </w:p>
+    <w:p>
+      <w:pPr>
+        <w:spacing w:after="0"/>
+        <w:ind w:firstLine="709"/>
+        <w:contextualSpacing/>
+        <w:rPr>
+          <w:lang w:val="uk-UA"/>
+        </w:rPr>
+      </w:pPr>
+      <w:r>
+        <w:rPr>
+          <w:lang w:val="uk-UA"/>
+        </w:rPr>
+        <w:t>Під час виконання практичного завдання до Теми №</w:t>
+      </w:r>
+      <w:r>
+        <w:t>4</w:t>
+      </w:r>
+      <w:r>
+        <w:rPr>
+          <w:lang w:val="uk-UA"/>
+        </w:rPr>
+        <w:t xml:space="preserve"> було надано варіанти рішення до наступних задач:</w:t>
+      </w:r>
+    </w:p>
+    <w:p>
+      <w:pPr>
+        <w:spacing w:after="0"/>
+        <w:ind w:firstLine="709"/>
+        <w:contextualSpacing/>
+        <w:jc w:val="center"/>
+        <w:rPr>
+          <w:b/>
+          <w:bCs/>
+          <w:lang w:val="uk-UA"/>
+        </w:rPr>
+      </w:pPr>
+      <w:r>
+        <w:rPr>
+          <w:b/>
+          <w:bCs/>
+          <w:lang w:val="uk-UA"/>
+        </w:rPr>
+        <w:t>Обробка винятків введення даних</w:t>
+      </w:r>
+    </w:p>
+    <w:p>
+      <w:pPr>
+        <w:spacing w:after="0"/>
+        <w:ind w:firstLine="709"/>
+        <w:contextualSpacing/>
+        <w:rPr>
+          <w:lang w:val="uk-UA"/>
+        </w:rPr>
+      </w:pPr>
+      <w:r>
+        <w:rPr>
+          <w:lang w:val="uk-UA"/>
+        </w:rPr>
+        <w:t xml:space="preserve">Розширити програму калькулятор функцією запитів даних для виконання операцій від користувача, що обробляє виняткові ситуації. </w:t>
+      </w:r>
+    </w:p>
+    <w:p>
+      <w:pPr>
+        <w:spacing w:after="0"/>
+        <w:ind w:firstLine="709"/>
+        <w:contextualSpacing/>
+        <w:rPr>
+          <w:noProof/>
+          <w:lang w:val="uk-UA"/>
+        </w:rPr>
+      </w:pPr>
+      <w:r>
+        <w:rPr>
+          <w:noProof/>
+          <w:lang w:val="uk-UA"/>
+        </w:rPr>
+        <w:t>У першому завданні я</w:t>
+      </w:r>
+      <w:r>
+        <w:rPr>
+          <w:noProof/>
+          <w:lang w:val="uk-UA"/>
+        </w:rPr>
+        <w:t xml:space="preserve"> розширила програму калькулятора, додавши функцію get_number(), яка запитує в користувача числа для виконання математичних операцій. Для обробки некоректного введення використала конструкцію try-except, яка перехоплює помилку ValueError і виводить відповідне повідомлення. Якщо ввести нечислове значення, програма повторно запитує число, доки не буде введено правильні дані. Завдяки цьому калькулятор працює стабільніше та не завершується через помилки введення.</w:t>
+      </w:r>
+    </w:p>
+    <w:p>
+      <w:pPr>
+        <w:spacing w:after="0"/>
+        <w:ind w:firstLine="709"/>
+        <w:contextualSpacing/>
+        <w:rPr>
+          <w:noProof/>
+          <w:lang w:val="uk-UA"/>
+        </w:rPr>
+      </w:pPr>
+      <w:r>
+        <w:rPr>
+          <w:noProof/>
+          <w:lang w:val="uk-UA"/>
+        </w:rPr>
+        <w:t>Текст програми:</w:t>
+      </w:r>
+    </w:p>
+    <w:p>
+      <w:pPr>
+        <w:spacing w:after="0"/>
+        <w:ind w:firstLine="709"/>
+        <w:contextualSpacing/>
+        <w:jc w:val="center"/>
+        <w:rPr>
+          <w:noProof/>
+          <w:lang w:val="uk-UA"/>
+        </w:rPr>
+      </w:pPr>
+      <w:r>
+        <w:rPr>
+          <w:noProof/>
+          <w:lang w:val="uk-UA"/>
+        </w:rPr>
+        <w:drawing>
+          <wp:inline distT="0" distB="0" distL="0" distR="0" wp14:anchorId="3BD219C7" wp14:editId="32D583D9">
+            <wp:extent cx="4697374" cy="4191000"/>
+            <wp:effectExtent l="0" t="0" r="8255" b="0"/>
+            <wp:docPr id="24" name="Рисунок 24"/>
+            <wp:cNvGraphicFramePr>
+              <a:graphicFrameLocks xmlns:a="http://schemas.openxmlformats.org/drawingml/2006/main" noChangeAspect="1"/>
+            </wp:cNvGraphicFramePr>
+            <a:graphic xmlns:a="http://schemas.openxmlformats.org/drawingml/2006/main">
+              <a:graphicData uri="http://schemas.openxmlformats.org/drawingml/2006/picture">
+                <pic:pic xmlns:pic="http://schemas.openxmlformats.org/drawingml/2006/picture">
+                  <pic:nvPicPr>
+                    <pic:cNvPr id="1" name=""/>
+                    <pic:cNvPicPr/>
+                  </pic:nvPicPr>
+                  <pic:blipFill>
+                    <a:blip r:embed="rId32"/>
+                    <a:stretch>
+                      <a:fillRect/>
+                    </a:stretch>
+                  </pic:blipFill>
+                  <pic:spPr>
+                    <a:xfrm>
+                      <a:off x="0" y="0"/>
+                      <a:ext cx="4734839" cy="4224426"/>
+                    </a:xfrm>
+                    <a:prstGeom prst="rect">
+                      <a:avLst/>
+                    </a:prstGeom>
+                  </pic:spPr>
+                </pic:pic>
+              </a:graphicData>
+            </a:graphic>
+          </wp:inline>
+        </w:drawing>
+      </w:r>
+    </w:p>
+    <w:p>
+      <w:pPr>
+        <w:spacing w:after="0"/>
+        <w:ind w:firstLine="709"/>
+        <w:contextualSpacing/>
+        <w:jc w:val="center"/>
+        <w:rPr>
+          <w:noProof/>
+          <w:lang w:val="uk-UA"/>
+        </w:rPr>
+      </w:pPr>
+      <w:r>
+        <w:rPr>
+          <w:noProof/>
+          <w:lang w:val="uk-UA"/>
+        </w:rPr>
+        <w:lastRenderedPageBreak/>
+        <w:drawing>
+          <wp:inline distT="0" distB="0" distL="0" distR="0" wp14:anchorId="7C2BDA40" wp14:editId="526621CB">
+            <wp:extent cx="3337560" cy="2596727"/>
+            <wp:effectExtent l="0" t="0" r="0" b="0"/>
+            <wp:docPr id="26" name="Рисунок 26"/>
+            <wp:cNvGraphicFramePr>
+              <a:graphicFrameLocks xmlns:a="http://schemas.openxmlformats.org/drawingml/2006/main" noChangeAspect="1"/>
+            </wp:cNvGraphicFramePr>
+            <a:graphic xmlns:a="http://schemas.openxmlformats.org/drawingml/2006/main">
+              <a:graphicData uri="http://schemas.openxmlformats.org/drawingml/2006/picture">
+                <pic:pic xmlns:pic="http://schemas.openxmlformats.org/drawingml/2006/picture">
+                  <pic:nvPicPr>
+                    <pic:cNvPr id="1" name=""/>
+                    <pic:cNvPicPr/>
+                  </pic:nvPicPr>
+                  <pic:blipFill>
+                    <a:blip r:embed="rId33"/>
+                    <a:stretch>
+                      <a:fillRect/>
+                    </a:stretch>
+                  </pic:blipFill>
+                  <pic:spPr>
+                    <a:xfrm>
+                      <a:off x="0" y="0"/>
+                      <a:ext cx="3388263" cy="2636175"/>
+                    </a:xfrm>
+                    <a:prstGeom prst="rect">
+                      <a:avLst/>
+                    </a:prstGeom>
+                  </pic:spPr>
+                </pic:pic>
+              </a:graphicData>
+            </a:graphic>
+          </wp:inline>
+        </w:drawing>
+      </w:r>
+    </w:p>
+    <w:p>
+      <w:pPr>
+        <w:spacing w:after="0"/>
+        <w:ind w:firstLine="709"/>
+        <w:contextualSpacing/>
+        <w:rPr>
+          <w:noProof/>
+          <w:lang w:val="uk-UA"/>
+        </w:rPr>
+      </w:pPr>
+      <w:r>
+        <w:rPr>
+          <w:noProof/>
+          <w:lang w:val="uk-UA"/>
+        </w:rPr>
+        <w:t>Результат:</w:t>
+      </w:r>
+    </w:p>
+    <w:p>
+      <w:pPr>
+        <w:spacing w:after="0"/>
+        <w:ind w:firstLine="709"/>
+        <w:contextualSpacing/>
+        <w:jc w:val="center"/>
+        <w:rPr>
+          <w:noProof/>
+        </w:rPr>
+      </w:pPr>
+      <w:r>
+        <w:rPr>
+          <w:noProof/>
+        </w:rPr>
+        <w:drawing>
+          <wp:inline distT="0" distB="0" distL="0" distR="0" wp14:anchorId="5B0F25C5" wp14:editId="6F28D26D">
+            <wp:extent cx="4054191" cy="2270957"/>
+            <wp:effectExtent l="0" t="0" r="3810" b="0"/>
+            <wp:docPr id="27" name="Рисунок 27"/>
+            <wp:cNvGraphicFramePr>
+              <a:graphicFrameLocks xmlns:a="http://schemas.openxmlformats.org/drawingml/2006/main" noChangeAspect="1"/>
+            </wp:cNvGraphicFramePr>
+            <a:graphic xmlns:a="http://schemas.openxmlformats.org/drawingml/2006/main">
+              <a:graphicData uri="http://schemas.openxmlformats.org/drawingml/2006/picture">
+                <pic:pic xmlns:pic="http://schemas.openxmlformats.org/drawingml/2006/picture">
+                  <pic:nvPicPr>
+                    <pic:cNvPr id="1" name=""/>
+                    <pic:cNvPicPr/>
+                  </pic:nvPicPr>
+                  <pic:blipFill>
+                    <a:blip r:embed="rId34"/>
+                    <a:stretch>
+                      <a:fillRect/>
+                    </a:stretch>
+                  </pic:blipFill>
+                  <pic:spPr>
+                    <a:xfrm>
+                      <a:off x="0" y="0"/>
+                      <a:ext cx="4054191" cy="2270957"/>
+                    </a:xfrm>
+                    <a:prstGeom prst="rect">
+                      <a:avLst/>
+                    </a:prstGeom>
+                  </pic:spPr>
+                </pic:pic>
+              </a:graphicData>
+            </a:graphic>
+          </wp:inline>
+        </w:drawing>
+      </w:r>
+    </w:p>
+    <w:p>
+      <w:pPr>
+        <w:spacing w:after="0"/>
+        <w:ind w:firstLine="709"/>
+        <w:contextualSpacing/>
+        <w:jc w:val="center"/>
+        <w:rPr>
+          <w:b/>
+          <w:bCs/>
+          <w:noProof/>
+        </w:rPr>
+      </w:pPr>
+      <w:r>
+        <w:rPr>
+          <w:b/>
+          <w:bCs/>
+          <w:noProof/>
+        </w:rPr>
+        <w:t>Обробка ділення на нуль</w:t>
+      </w:r>
+    </w:p>
+    <w:p>
+      <w:pPr>
+        <w:spacing w:after="0"/>
+        <w:ind w:firstLine="709"/>
+        <w:contextualSpacing/>
+        <w:rPr>
+          <w:b/>
+          <w:bCs/>
+          <w:noProof/>
+        </w:rPr>
+      </w:pPr>
+      <w:r>
+        <w:rPr>
+          <w:noProof/>
+          <w:lang w:val="uk-UA"/>
+        </w:rPr>
+        <w:t>Розширити функцію ділення обробкою виняткової ситуації ділення но нуль</w:t>
+      </w:r>
+    </w:p>
+    <w:p>
+      <w:pPr>
+        <w:spacing w:after="0"/>
+        <w:ind w:firstLine="709"/>
+        <w:contextualSpacing/>
+        <w:rPr>
+          <w:noProof/>
+          <w:lang w:val="uk-UA"/>
+        </w:rPr>
+      </w:pPr>
+      <w:r>
+        <w:rPr>
+          <w:noProof/>
+          <w:lang w:val="uk-UA"/>
+        </w:rPr>
+        <w:t>Для виконання другого завдання я</w:t>
+      </w:r>
+      <w:r>
+        <w:rPr>
+          <w:noProof/>
+          <w:lang w:val="uk-UA"/>
+        </w:rPr>
+        <w:t xml:space="preserve"> розширила функцію ділення, додавши перевірку на ділення на нуль. Якщо друге число дорівнює нулю, програма викликає виняток ZeroDivisionError, який обробляється за допомогою try-except. Також додала обробку помилки ValueError для некоректного введення чисел і загального винятку Exception для інших непередбачених помилок. Завдяки цьому калькулятор повідомляє про помилки та продовжує працювати без аварійного завершення.</w:t>
+      </w:r>
+    </w:p>
+    <w:p>
+      <w:pPr>
+        <w:spacing w:after="0"/>
+        <w:ind w:firstLine="709"/>
+        <w:contextualSpacing/>
+        <w:rPr>
+          <w:noProof/>
+          <w:lang w:val="uk-UA"/>
+        </w:rPr>
+      </w:pPr>
+      <w:r>
+        <w:rPr>
+          <w:noProof/>
+          <w:lang w:val="uk-UA"/>
+        </w:rPr>
+        <w:t>Текст програми:</w:t>
+      </w:r>
+    </w:p>
+    <w:p>
+      <w:pPr>
+        <w:spacing w:after="0"/>
+        <w:ind w:firstLine="709"/>
+        <w:contextualSpacing/>
+        <w:jc w:val="center"/>
+        <w:rPr>
+          <w:noProof/>
+          <w:lang w:val="uk-UA"/>
+        </w:rPr>
+      </w:pPr>
+      <w:r>
+        <w:rPr>
+          <w:noProof/>
+          <w:lang w:val="uk-UA"/>
+        </w:rPr>
+        <w:lastRenderedPageBreak/>
+        <w:drawing>
+          <wp:inline distT="0" distB="0" distL="0" distR="0" wp14:anchorId="541A8119" wp14:editId="53C48B34">
+            <wp:extent cx="4457700" cy="5320071"/>
+            <wp:effectExtent l="0" t="0" r="0" b="0"/>
+            <wp:docPr id="28" name="Рисунок 28"/>
+            <wp:cNvGraphicFramePr>
+              <a:graphicFrameLocks xmlns:a="http://schemas.openxmlformats.org/drawingml/2006/main" noChangeAspect="1"/>
+            </wp:cNvGraphicFramePr>
+            <a:graphic xmlns:a="http://schemas.openxmlformats.org/drawingml/2006/main">
+              <a:graphicData uri="http://schemas.openxmlformats.org/drawingml/2006/picture">
+                <pic:pic xmlns:pic="http://schemas.openxmlformats.org/drawingml/2006/picture">
+                  <pic:nvPicPr>
+                    <pic:cNvPr id="1" name=""/>
+                    <pic:cNvPicPr/>
+                  </pic:nvPicPr>
+                  <pic:blipFill>
+                    <a:blip r:embed="rId35"/>
+                    <a:stretch>
+                      <a:fillRect/>
+                    </a:stretch>
+                  </pic:blipFill>
+                  <pic:spPr>
+                    <a:xfrm>
+                      <a:off x="0" y="0"/>
+                      <a:ext cx="4471060" cy="5336016"/>
+                    </a:xfrm>
+                    <a:prstGeom prst="rect">
+                      <a:avLst/>
+                    </a:prstGeom>
+                  </pic:spPr>
+                </pic:pic>
+              </a:graphicData>
+            </a:graphic>
+          </wp:inline>
+        </w:drawing>
+      </w:r>
+    </w:p>
+    <w:p>
+      <w:pPr>
+        <w:spacing w:after="0"/>
+        <w:ind w:firstLine="709"/>
+        <w:contextualSpacing/>
+        <w:jc w:val="center"/>
+        <w:rPr>
+          <w:noProof/>
+          <w:lang w:val="uk-UA"/>
+        </w:rPr>
+      </w:pPr>
+      <w:r>
+        <w:rPr>
+          <w:noProof/>
+          <w:lang w:val="uk-UA"/>
+        </w:rPr>
+        <w:drawing>
+          <wp:inline distT="0" distB="0" distL="0" distR="0" wp14:anchorId="227D8901" wp14:editId="7A6C15CD">
+            <wp:extent cx="4518660" cy="3297979"/>
+            <wp:effectExtent l="0" t="0" r="0" b="0"/>
+            <wp:docPr id="29" name="Рисунок 29"/>
+            <wp:cNvGraphicFramePr>
+              <a:graphicFrameLocks xmlns:a="http://schemas.openxmlformats.org/drawingml/2006/main" noChangeAspect="1"/>
+            </wp:cNvGraphicFramePr>
+            <a:graphic xmlns:a="http://schemas.openxmlformats.org/drawingml/2006/main">
+              <a:graphicData uri="http://schemas.openxmlformats.org/drawingml/2006/picture">
+                <pic:pic xmlns:pic="http://schemas.openxmlformats.org/drawingml/2006/picture">
+                  <pic:nvPicPr>
+                    <pic:cNvPr id="1" name=""/>
+                    <pic:cNvPicPr/>
+                  </pic:nvPicPr>
+                  <pic:blipFill>
+                    <a:blip r:embed="rId36"/>
+                    <a:stretch>
+                      <a:fillRect/>
+                    </a:stretch>
+                  </pic:blipFill>
+                  <pic:spPr>
+                    <a:xfrm>
+                      <a:off x="0" y="0"/>
+                      <a:ext cx="4539117" cy="3312910"/>
+                    </a:xfrm>
+                    <a:prstGeom prst="rect">
+                      <a:avLst/>
+                    </a:prstGeom>
+                  </pic:spPr>
+                </pic:pic>
+              </a:graphicData>
+            </a:graphic>
+          </wp:inline>
+        </w:drawing>
+      </w:r>
+    </w:p>
+    <w:p>
+      <w:pPr>
+        <w:spacing w:after="0"/>
+        <w:ind w:firstLine="709"/>
+        <w:contextualSpacing/>
+        <w:rPr>
+          <w:noProof/>
+          <w:lang w:val="uk-UA"/>
+        </w:rPr>
+      </w:pPr>
+      <w:r>
+        <w:rPr>
+          <w:noProof/>
+          <w:lang w:val="uk-UA"/>
+        </w:rPr>
+        <w:lastRenderedPageBreak/>
+        <w:t>Результат:</w:t>
+      </w:r>
+    </w:p>
+    <w:p>
+      <w:pPr>
+        <w:spacing w:after="0"/>
+        <w:ind w:firstLine="709"/>
+        <w:contextualSpacing/>
+        <w:jc w:val="center"/>
+        <w:rPr>
+          <w:noProof/>
+        </w:rPr>
+      </w:pPr>
+      <w:r>
+        <w:rPr>
+          <w:noProof/>
+        </w:rPr>
+        <w:drawing>
+          <wp:inline distT="0" distB="0" distL="0" distR="0" wp14:anchorId="6761236E" wp14:editId="14992A53">
+            <wp:extent cx="4000847" cy="2430991"/>
+            <wp:effectExtent l="0" t="0" r="0" b="7620"/>
+            <wp:docPr id="35" name="Рисунок 35"/>
+            <wp:cNvGraphicFramePr>
+              <a:graphicFrameLocks xmlns:a="http://schemas.openxmlformats.org/drawingml/2006/main" noChangeAspect="1"/>
+            </wp:cNvGraphicFramePr>
+            <a:graphic xmlns:a="http://schemas.openxmlformats.org/drawingml/2006/main">
+              <a:graphicData uri="http://schemas.openxmlformats.org/drawingml/2006/picture">
+                <pic:pic xmlns:pic="http://schemas.openxmlformats.org/drawingml/2006/picture">
+                  <pic:nvPicPr>
+                    <pic:cNvPr id="1" name=""/>
+                    <pic:cNvPicPr/>
+                  </pic:nvPicPr>
+                  <pic:blipFill>
+                    <a:blip r:embed="rId37"/>
+                    <a:stretch>
+                      <a:fillRect/>
+                    </a:stretch>
+                  </pic:blipFill>
+                  <pic:spPr>
+                    <a:xfrm>
+                      <a:off x="0" y="0"/>
+                      <a:ext cx="4000847" cy="2430991"/>
+                    </a:xfrm>
+                    <a:prstGeom prst="rect">
+                      <a:avLst/>
+                    </a:prstGeom>
+                  </pic:spPr>
+                </pic:pic>
+              </a:graphicData>
+            </a:graphic>
+          </wp:inline>
+        </w:drawing>
+      </w:r>
+    </w:p>
+    <w:p>
+      <w:pPr>
+        <w:spacing w:after="0"/>
+        <w:ind w:firstLine="709"/>
+        <w:contextualSpacing/>
+        <w:jc w:val="center"/>
+        <w:rPr>
+          <w:b/>
+          <w:bCs/>
+          <w:noProof/>
+        </w:rPr>
+      </w:pPr>
+      <w:r>
+        <w:rPr>
+          <w:b/>
+          <w:bCs/>
+          <w:noProof/>
+        </w:rPr>
+        <w:t>Робота відповідно до Python Exceptions Reference</w:t>
+      </w:r>
+    </w:p>
+    <w:p>
+      <w:pPr>
+        <w:spacing w:after="0"/>
+        <w:ind w:firstLine="709"/>
+        <w:contextualSpacing/>
+        <w:rPr>
+          <w:lang w:val="uk-UA"/>
+        </w:rPr>
+      </w:pPr>
+      <w:r>
+        <w:rPr>
+          <w:lang w:val="uk-UA"/>
+        </w:rPr>
+        <w:t xml:space="preserve">Ознайомитись зі списком виняткових ситуацій за посиланням </w:t>
+      </w:r>
+      <w:hyperlink r:id="rId38" w:history="1">
+        <w:r>
+          <w:rPr>
+            <w:rStyle w:val="a4"/>
+            <w:lang w:val="uk-UA"/>
+          </w:rPr>
+          <w:t>https://docs.python.org/3/library/exceptions.html</w:t>
+        </w:r>
+      </w:hyperlink>
+      <w:r>
+        <w:rPr>
+          <w:lang w:val="uk-UA"/>
+        </w:rPr>
+        <w:t>.</w:t>
+      </w:r>
+    </w:p>
+    <w:p>
+      <w:pPr>
+        <w:spacing w:after="0"/>
+        <w:ind w:firstLine="709"/>
+        <w:contextualSpacing/>
+        <w:rPr>
+          <w:noProof/>
+          <w:lang w:val="uk-UA"/>
+        </w:rPr>
+      </w:pPr>
+      <w:r>
+        <w:rPr>
+          <w:noProof/>
+          <w:lang w:val="uk-UA"/>
+        </w:rPr>
+        <w:t>Я вдосконалила калькулятор, винісши введення чисел і перевірку математичних операцій в окремі функції get_number() та get_operation(). Додала обробку некоректного введення, перевірку допустимих операцій і можливість завершити програму, ввівши q на будь-якому етапі. Також зберегла обробку винятків для ділення на нуль та інших арифметичних і непередбачуваних помилок. Завдяки цим змінам програма стала зручнішою у використанні та надійнішою.</w:t>
+      </w:r>
+    </w:p>
+    <w:p>
+      <w:pPr>
+        <w:spacing w:after="0"/>
+        <w:ind w:firstLine="709"/>
+        <w:contextualSpacing/>
+        <w:rPr>
+          <w:noProof/>
+          <w:lang w:val="uk-UA"/>
+        </w:rPr>
+      </w:pPr>
+      <w:r>
+        <w:rPr>
+          <w:noProof/>
+          <w:lang w:val="uk-UA"/>
+        </w:rPr>
+        <w:t xml:space="preserve">Текст </w:t>
+      </w:r>
+      <w:r>
+        <w:rPr>
+          <w:noProof/>
+          <w:lang w:val="uk-UA"/>
+        </w:rPr>
+        <w:t>програми:</w:t>
+      </w:r>
+    </w:p>
+    <w:p>
+      <w:pPr>
+        <w:spacing w:after="0"/>
+        <w:ind w:firstLine="709"/>
+        <w:contextualSpacing/>
+        <w:jc w:val="center"/>
+        <w:rPr>
+          <w:noProof/>
+          <w:lang w:val="uk-UA"/>
+        </w:rPr>
+      </w:pPr>
+      <w:r>
+        <w:rPr>
+          <w:noProof/>
+          <w:lang w:val="uk-UA"/>
+        </w:rPr>
+        <w:lastRenderedPageBreak/>
+        <w:drawing>
+          <wp:inline distT="0" distB="0" distL="0" distR="0" wp14:anchorId="09A6A58C" wp14:editId="1D164984">
+            <wp:extent cx="4236720" cy="4779463"/>
+            <wp:effectExtent l="0" t="0" r="0" b="2540"/>
+            <wp:docPr id="30" name="Рисунок 30"/>
+            <wp:cNvGraphicFramePr>
+              <a:graphicFrameLocks xmlns:a="http://schemas.openxmlformats.org/drawingml/2006/main" noChangeAspect="1"/>
+            </wp:cNvGraphicFramePr>
+            <a:graphic xmlns:a="http://schemas.openxmlformats.org/drawingml/2006/main">
+              <a:graphicData uri="http://schemas.openxmlformats.org/drawingml/2006/picture">
+                <pic:pic xmlns:pic="http://schemas.openxmlformats.org/drawingml/2006/picture">
+                  <pic:nvPicPr>
+                    <pic:cNvPr id="1" name=""/>
+                    <pic:cNvPicPr/>
+                  </pic:nvPicPr>
+                  <pic:blipFill>
+                    <a:blip r:embed="rId39"/>
+                    <a:stretch>
+                      <a:fillRect/>
+                    </a:stretch>
+                  </pic:blipFill>
+                  <pic:spPr>
+                    <a:xfrm>
+                      <a:off x="0" y="0"/>
+                      <a:ext cx="4310004" cy="4862135"/>
+                    </a:xfrm>
+                    <a:prstGeom prst="rect">
+                      <a:avLst/>
+                    </a:prstGeom>
+                  </pic:spPr>
+                </pic:pic>
+              </a:graphicData>
+            </a:graphic>
+          </wp:inline>
+        </w:drawing>
+      </w:r>
+    </w:p>
+    <w:p>
+      <w:pPr>
+        <w:spacing w:after="0"/>
+        <w:ind w:firstLine="709"/>
+        <w:contextualSpacing/>
+        <w:jc w:val="center"/>
+        <w:rPr>
+          <w:noProof/>
+          <w:lang w:val="uk-UA"/>
+        </w:rPr>
+      </w:pPr>
+      <w:r>
+        <w:rPr>
+          <w:noProof/>
+          <w:lang w:val="uk-UA"/>
+        </w:rPr>
+        <w:drawing>
+          <wp:inline distT="0" distB="0" distL="0" distR="0" wp14:anchorId="61D76498" wp14:editId="09FBC2DA">
+            <wp:extent cx="3108960" cy="3931360"/>
+            <wp:effectExtent l="0" t="0" r="0" b="0"/>
+            <wp:docPr id="33" name="Рисунок 33"/>
+            <wp:cNvGraphicFramePr>
+              <a:graphicFrameLocks xmlns:a="http://schemas.openxmlformats.org/drawingml/2006/main" noChangeAspect="1"/>
+            </wp:cNvGraphicFramePr>
+            <a:graphic xmlns:a="http://schemas.openxmlformats.org/drawingml/2006/main">
+              <a:graphicData uri="http://schemas.openxmlformats.org/drawingml/2006/picture">
+                <pic:pic xmlns:pic="http://schemas.openxmlformats.org/drawingml/2006/picture">
+                  <pic:nvPicPr>
+                    <pic:cNvPr id="1" name=""/>
+                    <pic:cNvPicPr/>
+                  </pic:nvPicPr>
+                  <pic:blipFill>
+                    <a:blip r:embed="rId40"/>
+                    <a:stretch>
+                      <a:fillRect/>
+                    </a:stretch>
+                  </pic:blipFill>
+                  <pic:spPr>
+                    <a:xfrm>
+                      <a:off x="0" y="0"/>
+                      <a:ext cx="3140187" cy="3970847"/>
+                    </a:xfrm>
+                    <a:prstGeom prst="rect">
+                      <a:avLst/>
+                    </a:prstGeom>
+                  </pic:spPr>
+                </pic:pic>
+              </a:graphicData>
+            </a:graphic>
+          </wp:inline>
+        </w:drawing>
+      </w:r>
+    </w:p>
+    <w:p>
+      <w:pPr>
+        <w:spacing w:after="0"/>
+        <w:ind w:firstLine="709"/>
+        <w:contextualSpacing/>
+        <w:jc w:val="center"/>
+        <w:rPr>
+          <w:noProof/>
+          <w:lang w:val="uk-UA"/>
+        </w:rPr>
+      </w:pPr>
+      <w:r>
+        <w:rPr>
+          <w:noProof/>
+          <w:lang w:val="uk-UA"/>
+        </w:rPr>
+        <w:lastRenderedPageBreak/>
+        <w:drawing>
+          <wp:inline distT="0" distB="0" distL="0" distR="0" wp14:anchorId="306FB9C5" wp14:editId="3F8A6212">
+            <wp:extent cx="4175760" cy="783823"/>
+            <wp:effectExtent l="0" t="0" r="0" b="0"/>
+            <wp:docPr id="32" name="Рисунок 32"/>
+            <wp:cNvGraphicFramePr>
+              <a:graphicFrameLocks xmlns:a="http://schemas.openxmlformats.org/drawingml/2006/main" noChangeAspect="1"/>
+            </wp:cNvGraphicFramePr>
+            <a:graphic xmlns:a="http://schemas.openxmlformats.org/drawingml/2006/main">
+              <a:graphicData uri="http://schemas.openxmlformats.org/drawingml/2006/picture">
+                <pic:pic xmlns:pic="http://schemas.openxmlformats.org/drawingml/2006/picture">
+                  <pic:nvPicPr>
+                    <pic:cNvPr id="1" name=""/>
+                    <pic:cNvPicPr/>
+                  </pic:nvPicPr>
+                  <pic:blipFill>
+                    <a:blip r:embed="rId41"/>
+                    <a:stretch>
+                      <a:fillRect/>
+                    </a:stretch>
+                  </pic:blipFill>
+                  <pic:spPr>
+                    <a:xfrm>
+                      <a:off x="0" y="0"/>
+                      <a:ext cx="4196005" cy="787623"/>
+                    </a:xfrm>
+                    <a:prstGeom prst="rect">
+                      <a:avLst/>
+                    </a:prstGeom>
+                  </pic:spPr>
+                </pic:pic>
+              </a:graphicData>
+            </a:graphic>
+          </wp:inline>
+        </w:drawing>
+      </w:r>
+    </w:p>
+    <w:p>
+      <w:pPr>
+        <w:spacing w:after="0"/>
+        <w:ind w:firstLine="709"/>
+        <w:contextualSpacing/>
+        <w:rPr>
+          <w:noProof/>
+          <w:lang w:val="uk-UA"/>
+        </w:rPr>
+      </w:pPr>
+      <w:r>
+        <w:rPr>
+          <w:noProof/>
+          <w:lang w:val="uk-UA"/>
+        </w:rPr>
+        <w:t>Результат:</w:t>
+      </w:r>
+    </w:p>
+    <w:p>
+      <w:pPr>
+        <w:spacing w:after="0"/>
+        <w:ind w:firstLine="709"/>
+        <w:contextualSpacing/>
+        <w:jc w:val="center"/>
+        <w:rPr>
+          <w:noProof/>
+        </w:rPr>
+      </w:pPr>
+      <w:r>
+        <w:rPr>
+          <w:noProof/>
+        </w:rPr>
+        <w:drawing>
+          <wp:inline distT="0" distB="0" distL="0" distR="0" wp14:anchorId="52089968" wp14:editId="2EF20E96">
+            <wp:extent cx="4526672" cy="2911092"/>
+            <wp:effectExtent l="0" t="0" r="7620" b="3810"/>
+            <wp:docPr id="34" name="Рисунок 34"/>
+            <wp:cNvGraphicFramePr>
+              <a:graphicFrameLocks xmlns:a="http://schemas.openxmlformats.org/drawingml/2006/main" noChangeAspect="1"/>
+            </wp:cNvGraphicFramePr>
+            <a:graphic xmlns:a="http://schemas.openxmlformats.org/drawingml/2006/main">
+              <a:graphicData uri="http://schemas.openxmlformats.org/drawingml/2006/picture">
+                <pic:pic xmlns:pic="http://schemas.openxmlformats.org/drawingml/2006/picture">
+                  <pic:nvPicPr>
+                    <pic:cNvPr id="1" name=""/>
+                    <pic:cNvPicPr/>
+                  </pic:nvPicPr>
+                  <pic:blipFill>
+                    <a:blip r:embed="rId42"/>
+                    <a:stretch>
+                      <a:fillRect/>
+                    </a:stretch>
+                  </pic:blipFill>
+                  <pic:spPr>
+                    <a:xfrm>
+                      <a:off x="0" y="0"/>
+                      <a:ext cx="4526672" cy="2911092"/>
+                    </a:xfrm>
+                    <a:prstGeom prst="rect">
+                      <a:avLst/>
+                    </a:prstGeom>
+                  </pic:spPr>
+                </pic:pic>
+              </a:graphicData>
+            </a:graphic>
+          </wp:inline>
+        </w:drawing>
+      </w:r>
+    </w:p>
+    <w:p>
+      <w:pPr>
+        <w:spacing w:after="0"/>
+        <w:ind w:firstLine="0"/>
+        <w:contextualSpacing/>
+        <w:rPr>
+          <w:lang w:val="ru-RU"/>
+        </w:rPr>
+      </w:pPr>
+      <w:r>
+        <w:rPr>
+          <w:lang w:val="uk-UA"/>
+        </w:rPr>
+        <w:t xml:space="preserve">Посилання на </w:t>
+      </w:r>
+      <w:proofErr w:type="spellStart"/>
+      <w:r>
+        <w:t>github</w:t>
+      </w:r>
+      <w:proofErr w:type="spellEnd"/>
+      <w:r>
+        <w:rPr>
+          <w:lang w:val="ru-RU"/>
+        </w:rPr>
+        <w:t>:</w:t>
+      </w:r>
+      <w:r>
+        <w:rPr>
+          <w:lang w:val="ru-RU"/>
+        </w:rPr>
+        <w:t xml:space="preserve"> </w:t>
+      </w:r>
+    </w:p>
+    <w:p>
+      <w:pPr>
+        <w:spacing w:after="0"/>
+        <w:ind w:firstLine="0"/>
+        <w:contextualSpacing/>
+        <w:rPr>
+          <w:lang w:val="ru-RU"/>
+        </w:rPr>
+      </w:pPr>
+      <w:hyperlink r:id="rId43" w:history="1">
+        <w:r>
+          <w:rPr>
+            <w:rStyle w:val="a4"/>
+            <w:lang w:val="ru-RU"/>
+          </w:rPr>
+          <w:t>https://github.com/daryehorova/DariaYehorovaKB252.git</w:t>
+        </w:r>
+      </w:hyperlink>
+    </w:p>
+    <w:p>
+      <w:pPr>
+        <w:spacing w:after="0"/>
+        <w:ind w:firstLine="0"/>
+        <w:contextualSpacing/>
+        <w:rPr>
+          <w:lang w:val="ru-RU"/>
+        </w:rPr>
+      </w:pPr>
+      <w:r>
+        <w:rPr>
+          <w:lang w:val="uk-UA"/>
+        </w:rPr>
+        <w:t xml:space="preserve">Знімок екрану з посилання на </w:t>
+      </w:r>
+      <w:proofErr w:type="spellStart"/>
+      <w:r>
+        <w:t>github</w:t>
+      </w:r>
+      <w:proofErr w:type="spellEnd"/>
+      <w:r>
+        <w:rPr>
+          <w:lang w:val="ru-RU"/>
+        </w:rPr>
+        <w:t>:</w:t>
+      </w:r>
+      <w:r>
+        <w:rPr>
+          <w:lang w:val="ru-RU"/>
+        </w:rPr>
+        <w:t xml:space="preserve"> </w:t>
+      </w:r>
+    </w:p>
+    <w:p>
+      <w:pPr>
+        <w:spacing w:after="0"/>
         <w:ind w:firstLine="0"/>
         <w:contextualSpacing/>
         <w:rPr>
@@ -4148,9 +5137,9 @@
     </w:p>
     <w:sectPr>
       <w:pgSz w:w="12240" w:h="15840"/>
-      <w:pgMar w:top="1440" w:right="1440" w:bottom="1440" w:left="1440" w:header="720" w:footer="720" w:gutter="0"/>
+      <w:pgMar w:top="851" w:right="851" w:bottom="851" w:left="1134" w:header="720" w:footer="720" w:gutter="0"/>
       <w:cols w:space="720"/>
-      <w:docGrid w:linePitch="360"/>
+      <w:docGrid w:linePitch="381"/>
     </w:sectPr>
   </w:body>
 </w:document>
@@ -4341,6 +5330,36 @@
   </w:num>
   <w:num w:numId="2">
     <w:abstractNumId w:val="1"/>
+  </w:num>
+  <w:num w:numId="3">
+    <w:abstractNumId w:val="1"/>
+    <w:lvlOverride w:ilvl="0">
+      <w:startOverride w:val="1"/>
+    </w:lvlOverride>
+    <w:lvlOverride w:ilvl="1">
+      <w:startOverride w:val="1"/>
+    </w:lvlOverride>
+    <w:lvlOverride w:ilvl="2">
+      <w:startOverride w:val="1"/>
+    </w:lvlOverride>
+    <w:lvlOverride w:ilvl="3">
+      <w:startOverride w:val="1"/>
+    </w:lvlOverride>
+    <w:lvlOverride w:ilvl="4">
+      <w:startOverride w:val="1"/>
+    </w:lvlOverride>
+    <w:lvlOverride w:ilvl="5">
+      <w:startOverride w:val="1"/>
+    </w:lvlOverride>
+    <w:lvlOverride w:ilvl="6">
+      <w:startOverride w:val="1"/>
+    </w:lvlOverride>
+    <w:lvlOverride w:ilvl="7">
+      <w:startOverride w:val="1"/>
+    </w:lvlOverride>
+    <w:lvlOverride w:ilvl="8">
+      <w:startOverride w:val="1"/>
+    </w:lvlOverride>
   </w:num>
 </w:numbering>
 </file>

</xml_diff>